<commit_message>
Add spend-vs-earn breakdown: per-SKU + 12-month ramp projection
New XLSX sheet 'Расходы_Доходы' (live formulas: order qty -> spend, UAE
sales -> revenue/EBITDA per month & year, plus 12-month ramp with launch
PPC 35% burn). New DOCX section 7.1 with the same per-SKU table and cash
summary.

Spend: ~559k AED start (417k inventory + 142k launch). Earn at full ramp:
~306k AED revenue/mo, ~73k AED EBITDA/mo (~879k/yr). Year-1 cash result
after launch burn ~+378k AED.

Co-Authored-By: Claude Opus 4.8 <noreply@anthropic.com>
Claude-Session: https://claude.ai/code/session_01GAAKUQwoVwhjmCDaGhFmCq
</commit_message>
<xml_diff>
--- a/deliverables/UAE_HomeKitchen_Report_2026-07.docx
+++ b/deliverables/UAE_HomeKitchen_Report_2026-07.docx
@@ -7179,6 +7179,3083 @@
           <w:sz w:val="18"/>
         </w:rPr>
         <w:t>Все объёмы заказа, капитал и окупаемость по каждому SKU редактируются в Excel (лист «Инвестиции»).</w:t>
+      </w:r>
+    </w:p>
+    <w:p>
+      <w:pPr>
+        <w:pStyle w:val="Heading2"/>
+      </w:pPr>
+      <w:r>
+        <w:rPr>
+          <w:color w:val="1F4E78"/>
+        </w:rPr>
+        <w:t>7.1. Сколько потратим и сколько заработаем</w:t>
+      </w:r>
+    </w:p>
+    <w:tbl>
+      <w:tblPr>
+        <w:tblStyle w:val="LightGrid-Accent1"/>
+        <w:tblW w:type="auto" w:w="0"/>
+        <w:tblLook w:firstColumn="1" w:firstRow="1" w:lastColumn="0" w:lastRow="0" w:noHBand="0" w:noVBand="1" w:val="04A0"/>
+      </w:tblPr>
+      <w:tblGrid>
+        <w:gridCol w:w="1234"/>
+        <w:gridCol w:w="1234"/>
+        <w:gridCol w:w="1234"/>
+        <w:gridCol w:w="1234"/>
+        <w:gridCol w:w="1234"/>
+        <w:gridCol w:w="1234"/>
+        <w:gridCol w:w="1234"/>
+      </w:tblGrid>
+      <w:tr>
+        <w:tc>
+          <w:tcPr>
+            <w:tcW w:type="dxa" w:w="1234"/>
+            <w:shd w:val="clear" w:fill="1F4E78"/>
+          </w:tcPr>
+          <w:p>
+            <w:pPr>
+              <w:spacing w:after="0" w:before="0"/>
+              <w:jc w:val="center"/>
+            </w:pPr>
+            <w:r/>
+            <w:r>
+              <w:rPr>
+                <w:b/>
+                <w:color w:val="FFFFFF"/>
+                <w:sz w:val="16"/>
+              </w:rPr>
+              <w:t>№</w:t>
+            </w:r>
+          </w:p>
+        </w:tc>
+        <w:tc>
+          <w:tcPr>
+            <w:tcW w:type="dxa" w:w="1234"/>
+            <w:shd w:val="clear" w:fill="1F4E78"/>
+          </w:tcPr>
+          <w:p>
+            <w:pPr>
+              <w:spacing w:after="0" w:before="0"/>
+              <w:jc w:val="center"/>
+            </w:pPr>
+            <w:r/>
+            <w:r>
+              <w:rPr>
+                <w:b/>
+                <w:color w:val="FFFFFF"/>
+                <w:sz w:val="16"/>
+              </w:rPr>
+              <w:t>Товар</w:t>
+            </w:r>
+          </w:p>
+        </w:tc>
+        <w:tc>
+          <w:tcPr>
+            <w:tcW w:type="dxa" w:w="1234"/>
+            <w:shd w:val="clear" w:fill="1F4E78"/>
+          </w:tcPr>
+          <w:p>
+            <w:pPr>
+              <w:spacing w:after="0" w:before="0"/>
+              <w:jc w:val="center"/>
+            </w:pPr>
+            <w:r/>
+            <w:r>
+              <w:rPr>
+                <w:b/>
+                <w:color w:val="FFFFFF"/>
+                <w:sz w:val="16"/>
+              </w:rPr>
+              <w:t>Заказ, шт</w:t>
+            </w:r>
+          </w:p>
+        </w:tc>
+        <w:tc>
+          <w:tcPr>
+            <w:tcW w:type="dxa" w:w="1234"/>
+            <w:shd w:val="clear" w:fill="1F4E78"/>
+          </w:tcPr>
+          <w:p>
+            <w:pPr>
+              <w:spacing w:after="0" w:before="0"/>
+              <w:jc w:val="center"/>
+            </w:pPr>
+            <w:r/>
+            <w:r>
+              <w:rPr>
+                <w:b/>
+                <w:color w:val="FFFFFF"/>
+                <w:sz w:val="16"/>
+              </w:rPr>
+              <w:t>Закупка AED</w:t>
+            </w:r>
+          </w:p>
+        </w:tc>
+        <w:tc>
+          <w:tcPr>
+            <w:tcW w:type="dxa" w:w="1234"/>
+            <w:shd w:val="clear" w:fill="1F4E78"/>
+          </w:tcPr>
+          <w:p>
+            <w:pPr>
+              <w:spacing w:after="0" w:before="0"/>
+              <w:jc w:val="center"/>
+            </w:pPr>
+            <w:r/>
+            <w:r>
+              <w:rPr>
+                <w:b/>
+                <w:color w:val="FFFFFF"/>
+                <w:sz w:val="16"/>
+              </w:rPr>
+              <w:t>Выручка/мес AED</w:t>
+            </w:r>
+          </w:p>
+        </w:tc>
+        <w:tc>
+          <w:tcPr>
+            <w:tcW w:type="dxa" w:w="1234"/>
+            <w:shd w:val="clear" w:fill="1F4E78"/>
+          </w:tcPr>
+          <w:p>
+            <w:pPr>
+              <w:spacing w:after="0" w:before="0"/>
+              <w:jc w:val="center"/>
+            </w:pPr>
+            <w:r/>
+            <w:r>
+              <w:rPr>
+                <w:b/>
+                <w:color w:val="FFFFFF"/>
+                <w:sz w:val="16"/>
+              </w:rPr>
+              <w:t>EBITDA/мес AED</w:t>
+            </w:r>
+          </w:p>
+        </w:tc>
+        <w:tc>
+          <w:tcPr>
+            <w:tcW w:type="dxa" w:w="1234"/>
+            <w:shd w:val="clear" w:fill="1F4E78"/>
+          </w:tcPr>
+          <w:p>
+            <w:pPr>
+              <w:spacing w:after="0" w:before="0"/>
+              <w:jc w:val="center"/>
+            </w:pPr>
+            <w:r/>
+            <w:r>
+              <w:rPr>
+                <w:b/>
+                <w:color w:val="FFFFFF"/>
+                <w:sz w:val="16"/>
+              </w:rPr>
+              <w:t>EBITDA/год AED</w:t>
+            </w:r>
+          </w:p>
+        </w:tc>
+      </w:tr>
+      <w:tr>
+        <w:tc>
+          <w:tcPr>
+            <w:tcW w:type="dxa" w:w="1234"/>
+          </w:tcPr>
+          <w:p>
+            <w:pPr>
+              <w:spacing w:after="0" w:before="0"/>
+              <w:jc w:val="center"/>
+            </w:pPr>
+            <w:r/>
+            <w:r>
+              <w:rPr>
+                <w:b w:val="0"/>
+                <w:sz w:val="16"/>
+              </w:rPr>
+              <w:t>1</w:t>
+            </w:r>
+          </w:p>
+        </w:tc>
+        <w:tc>
+          <w:tcPr>
+            <w:tcW w:type="dxa" w:w="1234"/>
+          </w:tcPr>
+          <w:p>
+            <w:pPr>
+              <w:spacing w:after="0" w:before="0"/>
+            </w:pPr>
+            <w:r/>
+            <w:r>
+              <w:rPr>
+                <w:b w:val="0"/>
+                <w:sz w:val="15"/>
+              </w:rPr>
+              <w:t>Мини-вентилятор ручной турбо, аккумуляторный</w:t>
+            </w:r>
+          </w:p>
+        </w:tc>
+        <w:tc>
+          <w:tcPr>
+            <w:tcW w:type="dxa" w:w="1234"/>
+          </w:tcPr>
+          <w:p>
+            <w:pPr>
+              <w:spacing w:after="0" w:before="0"/>
+              <w:jc w:val="center"/>
+            </w:pPr>
+            <w:r/>
+            <w:r>
+              <w:rPr>
+                <w:b w:val="0"/>
+                <w:sz w:val="16"/>
+              </w:rPr>
+              <w:t>600</w:t>
+            </w:r>
+          </w:p>
+        </w:tc>
+        <w:tc>
+          <w:tcPr>
+            <w:tcW w:type="dxa" w:w="1234"/>
+          </w:tcPr>
+          <w:p>
+            <w:pPr>
+              <w:spacing w:after="0" w:before="0"/>
+              <w:jc w:val="center"/>
+            </w:pPr>
+            <w:r/>
+            <w:r>
+              <w:rPr>
+                <w:b w:val="0"/>
+                <w:sz w:val="16"/>
+              </w:rPr>
+              <w:t>14 082</w:t>
+            </w:r>
+          </w:p>
+        </w:tc>
+        <w:tc>
+          <w:tcPr>
+            <w:tcW w:type="dxa" w:w="1234"/>
+          </w:tcPr>
+          <w:p>
+            <w:pPr>
+              <w:spacing w:after="0" w:before="0"/>
+              <w:jc w:val="center"/>
+            </w:pPr>
+            <w:r/>
+            <w:r>
+              <w:rPr>
+                <w:b w:val="0"/>
+                <w:sz w:val="16"/>
+              </w:rPr>
+              <w:t>15 600</w:t>
+            </w:r>
+          </w:p>
+        </w:tc>
+        <w:tc>
+          <w:tcPr>
+            <w:tcW w:type="dxa" w:w="1234"/>
+          </w:tcPr>
+          <w:p>
+            <w:pPr>
+              <w:spacing w:after="0" w:before="0"/>
+              <w:jc w:val="center"/>
+            </w:pPr>
+            <w:r/>
+            <w:r>
+              <w:rPr>
+                <w:b w:val="0"/>
+                <w:sz w:val="16"/>
+              </w:rPr>
+              <w:t>4 797</w:t>
+            </w:r>
+          </w:p>
+        </w:tc>
+        <w:tc>
+          <w:tcPr>
+            <w:tcW w:type="dxa" w:w="1234"/>
+          </w:tcPr>
+          <w:p>
+            <w:pPr>
+              <w:spacing w:after="0" w:before="0"/>
+              <w:jc w:val="center"/>
+            </w:pPr>
+            <w:r/>
+            <w:r>
+              <w:rPr>
+                <w:b w:val="0"/>
+                <w:sz w:val="16"/>
+              </w:rPr>
+              <w:t>57 564</w:t>
+            </w:r>
+          </w:p>
+        </w:tc>
+      </w:tr>
+      <w:tr>
+        <w:tc>
+          <w:tcPr>
+            <w:tcW w:type="dxa" w:w="1234"/>
+          </w:tcPr>
+          <w:p>
+            <w:pPr>
+              <w:spacing w:after="0" w:before="0"/>
+              <w:jc w:val="center"/>
+            </w:pPr>
+            <w:r/>
+            <w:r>
+              <w:rPr>
+                <w:b w:val="0"/>
+                <w:sz w:val="16"/>
+              </w:rPr>
+              <w:t>2</w:t>
+            </w:r>
+          </w:p>
+        </w:tc>
+        <w:tc>
+          <w:tcPr>
+            <w:tcW w:type="dxa" w:w="1234"/>
+          </w:tcPr>
+          <w:p>
+            <w:pPr>
+              <w:spacing w:after="0" w:before="0"/>
+            </w:pPr>
+            <w:r/>
+            <w:r>
+              <w:rPr>
+                <w:b w:val="0"/>
+                <w:sz w:val="15"/>
+              </w:rPr>
+              <w:t>Вентилятор на шею безлопастной (носимый)</w:t>
+            </w:r>
+          </w:p>
+        </w:tc>
+        <w:tc>
+          <w:tcPr>
+            <w:tcW w:type="dxa" w:w="1234"/>
+          </w:tcPr>
+          <w:p>
+            <w:pPr>
+              <w:spacing w:after="0" w:before="0"/>
+              <w:jc w:val="center"/>
+            </w:pPr>
+            <w:r/>
+            <w:r>
+              <w:rPr>
+                <w:b w:val="0"/>
+                <w:sz w:val="16"/>
+              </w:rPr>
+              <w:t>500</w:t>
+            </w:r>
+          </w:p>
+        </w:tc>
+        <w:tc>
+          <w:tcPr>
+            <w:tcW w:type="dxa" w:w="1234"/>
+          </w:tcPr>
+          <w:p>
+            <w:pPr>
+              <w:spacing w:after="0" w:before="0"/>
+              <w:jc w:val="center"/>
+            </w:pPr>
+            <w:r/>
+            <w:r>
+              <w:rPr>
+                <w:b w:val="0"/>
+                <w:sz w:val="16"/>
+              </w:rPr>
+              <w:t>14 600</w:t>
+            </w:r>
+          </w:p>
+        </w:tc>
+        <w:tc>
+          <w:tcPr>
+            <w:tcW w:type="dxa" w:w="1234"/>
+          </w:tcPr>
+          <w:p>
+            <w:pPr>
+              <w:spacing w:after="0" w:before="0"/>
+              <w:jc w:val="center"/>
+            </w:pPr>
+            <w:r/>
+            <w:r>
+              <w:rPr>
+                <w:b w:val="0"/>
+                <w:sz w:val="16"/>
+              </w:rPr>
+              <w:t>14 880</w:t>
+            </w:r>
+          </w:p>
+        </w:tc>
+        <w:tc>
+          <w:tcPr>
+            <w:tcW w:type="dxa" w:w="1234"/>
+          </w:tcPr>
+          <w:p>
+            <w:pPr>
+              <w:spacing w:after="0" w:before="0"/>
+              <w:jc w:val="center"/>
+            </w:pPr>
+            <w:r/>
+            <w:r>
+              <w:rPr>
+                <w:b w:val="0"/>
+                <w:sz w:val="16"/>
+              </w:rPr>
+              <w:t>4 439</w:t>
+            </w:r>
+          </w:p>
+        </w:tc>
+        <w:tc>
+          <w:tcPr>
+            <w:tcW w:type="dxa" w:w="1234"/>
+          </w:tcPr>
+          <w:p>
+            <w:pPr>
+              <w:spacing w:after="0" w:before="0"/>
+              <w:jc w:val="center"/>
+            </w:pPr>
+            <w:r/>
+            <w:r>
+              <w:rPr>
+                <w:b w:val="0"/>
+                <w:sz w:val="16"/>
+              </w:rPr>
+              <w:t>53 268</w:t>
+            </w:r>
+          </w:p>
+        </w:tc>
+      </w:tr>
+      <w:tr>
+        <w:tc>
+          <w:tcPr>
+            <w:tcW w:type="dxa" w:w="1234"/>
+          </w:tcPr>
+          <w:p>
+            <w:pPr>
+              <w:spacing w:after="0" w:before="0"/>
+              <w:jc w:val="center"/>
+            </w:pPr>
+            <w:r/>
+            <w:r>
+              <w:rPr>
+                <w:b w:val="0"/>
+                <w:sz w:val="16"/>
+              </w:rPr>
+              <w:t>3</w:t>
+            </w:r>
+          </w:p>
+        </w:tc>
+        <w:tc>
+          <w:tcPr>
+            <w:tcW w:type="dxa" w:w="1234"/>
+            <w:shd w:val="clear" w:fill="FCE4D6"/>
+          </w:tcPr>
+          <w:p>
+            <w:pPr>
+              <w:spacing w:after="0" w:before="0"/>
+            </w:pPr>
+            <w:r/>
+            <w:r>
+              <w:rPr>
+                <w:b w:val="0"/>
+                <w:sz w:val="15"/>
+              </w:rPr>
+              <w:t>Портативный кондиционер/охладитель воздуха</w:t>
+            </w:r>
+          </w:p>
+        </w:tc>
+        <w:tc>
+          <w:tcPr>
+            <w:tcW w:type="dxa" w:w="1234"/>
+          </w:tcPr>
+          <w:p>
+            <w:pPr>
+              <w:spacing w:after="0" w:before="0"/>
+              <w:jc w:val="center"/>
+            </w:pPr>
+            <w:r/>
+            <w:r>
+              <w:rPr>
+                <w:b w:val="0"/>
+                <w:sz w:val="16"/>
+              </w:rPr>
+              <w:t>300</w:t>
+            </w:r>
+          </w:p>
+        </w:tc>
+        <w:tc>
+          <w:tcPr>
+            <w:tcW w:type="dxa" w:w="1234"/>
+          </w:tcPr>
+          <w:p>
+            <w:pPr>
+              <w:spacing w:after="0" w:before="0"/>
+              <w:jc w:val="center"/>
+            </w:pPr>
+            <w:r/>
+            <w:r>
+              <w:rPr>
+                <w:b w:val="0"/>
+                <w:sz w:val="16"/>
+              </w:rPr>
+              <w:t>20 046</w:t>
+            </w:r>
+          </w:p>
+        </w:tc>
+        <w:tc>
+          <w:tcPr>
+            <w:tcW w:type="dxa" w:w="1234"/>
+          </w:tcPr>
+          <w:p>
+            <w:pPr>
+              <w:spacing w:after="0" w:before="0"/>
+              <w:jc w:val="center"/>
+            </w:pPr>
+            <w:r/>
+            <w:r>
+              <w:rPr>
+                <w:b w:val="0"/>
+                <w:sz w:val="16"/>
+              </w:rPr>
+              <w:t>14 940</w:t>
+            </w:r>
+          </w:p>
+        </w:tc>
+        <w:tc>
+          <w:tcPr>
+            <w:tcW w:type="dxa" w:w="1234"/>
+          </w:tcPr>
+          <w:p>
+            <w:pPr>
+              <w:spacing w:after="0" w:before="0"/>
+              <w:jc w:val="center"/>
+            </w:pPr>
+            <w:r/>
+            <w:r>
+              <w:rPr>
+                <w:b w:val="0"/>
+                <w:sz w:val="16"/>
+              </w:rPr>
+              <w:t>4 121</w:t>
+            </w:r>
+          </w:p>
+        </w:tc>
+        <w:tc>
+          <w:tcPr>
+            <w:tcW w:type="dxa" w:w="1234"/>
+          </w:tcPr>
+          <w:p>
+            <w:pPr>
+              <w:spacing w:after="0" w:before="0"/>
+              <w:jc w:val="center"/>
+            </w:pPr>
+            <w:r/>
+            <w:r>
+              <w:rPr>
+                <w:b w:val="0"/>
+                <w:sz w:val="16"/>
+              </w:rPr>
+              <w:t>49 452</w:t>
+            </w:r>
+          </w:p>
+        </w:tc>
+      </w:tr>
+      <w:tr>
+        <w:tc>
+          <w:tcPr>
+            <w:tcW w:type="dxa" w:w="1234"/>
+          </w:tcPr>
+          <w:p>
+            <w:pPr>
+              <w:spacing w:after="0" w:before="0"/>
+              <w:jc w:val="center"/>
+            </w:pPr>
+            <w:r/>
+            <w:r>
+              <w:rPr>
+                <w:b w:val="0"/>
+                <w:sz w:val="16"/>
+              </w:rPr>
+              <w:t>4</w:t>
+            </w:r>
+          </w:p>
+        </w:tc>
+        <w:tc>
+          <w:tcPr>
+            <w:tcW w:type="dxa" w:w="1234"/>
+          </w:tcPr>
+          <w:p>
+            <w:pPr>
+              <w:spacing w:after="0" w:before="0"/>
+            </w:pPr>
+            <w:r/>
+            <w:r>
+              <w:rPr>
+                <w:b w:val="0"/>
+                <w:sz w:val="15"/>
+              </w:rPr>
+              <w:t>Очиститель воздуха для дома (HEPA), большая комната</w:t>
+            </w:r>
+          </w:p>
+        </w:tc>
+        <w:tc>
+          <w:tcPr>
+            <w:tcW w:type="dxa" w:w="1234"/>
+          </w:tcPr>
+          <w:p>
+            <w:pPr>
+              <w:spacing w:after="0" w:before="0"/>
+              <w:jc w:val="center"/>
+            </w:pPr>
+            <w:r/>
+            <w:r>
+              <w:rPr>
+                <w:b w:val="0"/>
+                <w:sz w:val="16"/>
+              </w:rPr>
+              <w:t>300</w:t>
+            </w:r>
+          </w:p>
+        </w:tc>
+        <w:tc>
+          <w:tcPr>
+            <w:tcW w:type="dxa" w:w="1234"/>
+          </w:tcPr>
+          <w:p>
+            <w:pPr>
+              <w:spacing w:after="0" w:before="0"/>
+              <w:jc w:val="center"/>
+            </w:pPr>
+            <w:r/>
+            <w:r>
+              <w:rPr>
+                <w:b w:val="0"/>
+                <w:sz w:val="16"/>
+              </w:rPr>
+              <w:t>34 659</w:t>
+            </w:r>
+          </w:p>
+        </w:tc>
+        <w:tc>
+          <w:tcPr>
+            <w:tcW w:type="dxa" w:w="1234"/>
+          </w:tcPr>
+          <w:p>
+            <w:pPr>
+              <w:spacing w:after="0" w:before="0"/>
+              <w:jc w:val="center"/>
+            </w:pPr>
+            <w:r/>
+            <w:r>
+              <w:rPr>
+                <w:b w:val="0"/>
+                <w:sz w:val="16"/>
+              </w:rPr>
+              <w:t>44 280</w:t>
+            </w:r>
+          </w:p>
+        </w:tc>
+        <w:tc>
+          <w:tcPr>
+            <w:tcW w:type="dxa" w:w="1234"/>
+          </w:tcPr>
+          <w:p>
+            <w:pPr>
+              <w:spacing w:after="0" w:before="0"/>
+              <w:jc w:val="center"/>
+            </w:pPr>
+            <w:r/>
+            <w:r>
+              <w:rPr>
+                <w:b w:val="0"/>
+                <w:sz w:val="16"/>
+              </w:rPr>
+              <w:t>10 590</w:t>
+            </w:r>
+          </w:p>
+        </w:tc>
+        <w:tc>
+          <w:tcPr>
+            <w:tcW w:type="dxa" w:w="1234"/>
+          </w:tcPr>
+          <w:p>
+            <w:pPr>
+              <w:spacing w:after="0" w:before="0"/>
+              <w:jc w:val="center"/>
+            </w:pPr>
+            <w:r/>
+            <w:r>
+              <w:rPr>
+                <w:b w:val="0"/>
+                <w:sz w:val="16"/>
+              </w:rPr>
+              <w:t>127 080</w:t>
+            </w:r>
+          </w:p>
+        </w:tc>
+      </w:tr>
+      <w:tr>
+        <w:tc>
+          <w:tcPr>
+            <w:tcW w:type="dxa" w:w="1234"/>
+          </w:tcPr>
+          <w:p>
+            <w:pPr>
+              <w:spacing w:after="0" w:before="0"/>
+              <w:jc w:val="center"/>
+            </w:pPr>
+            <w:r/>
+            <w:r>
+              <w:rPr>
+                <w:b w:val="0"/>
+                <w:sz w:val="16"/>
+              </w:rPr>
+              <w:t>5</w:t>
+            </w:r>
+          </w:p>
+        </w:tc>
+        <w:tc>
+          <w:tcPr>
+            <w:tcW w:type="dxa" w:w="1234"/>
+          </w:tcPr>
+          <w:p>
+            <w:pPr>
+              <w:spacing w:after="0" w:before="0"/>
+            </w:pPr>
+            <w:r/>
+            <w:r>
+              <w:rPr>
+                <w:b w:val="0"/>
+                <w:sz w:val="15"/>
+              </w:rPr>
+              <w:t>Осушитель воздуха для дома (~93 м²)</w:t>
+            </w:r>
+          </w:p>
+        </w:tc>
+        <w:tc>
+          <w:tcPr>
+            <w:tcW w:type="dxa" w:w="1234"/>
+          </w:tcPr>
+          <w:p>
+            <w:pPr>
+              <w:spacing w:after="0" w:before="0"/>
+              <w:jc w:val="center"/>
+            </w:pPr>
+            <w:r/>
+            <w:r>
+              <w:rPr>
+                <w:b w:val="0"/>
+                <w:sz w:val="16"/>
+              </w:rPr>
+              <w:t>250</w:t>
+            </w:r>
+          </w:p>
+        </w:tc>
+        <w:tc>
+          <w:tcPr>
+            <w:tcW w:type="dxa" w:w="1234"/>
+          </w:tcPr>
+          <w:p>
+            <w:pPr>
+              <w:spacing w:after="0" w:before="0"/>
+              <w:jc w:val="center"/>
+            </w:pPr>
+            <w:r/>
+            <w:r>
+              <w:rPr>
+                <w:b w:val="0"/>
+                <w:sz w:val="16"/>
+              </w:rPr>
+              <w:t>19 222</w:t>
+            </w:r>
+          </w:p>
+        </w:tc>
+        <w:tc>
+          <w:tcPr>
+            <w:tcW w:type="dxa" w:w="1234"/>
+          </w:tcPr>
+          <w:p>
+            <w:pPr>
+              <w:spacing w:after="0" w:before="0"/>
+              <w:jc w:val="center"/>
+            </w:pPr>
+            <w:r/>
+            <w:r>
+              <w:rPr>
+                <w:b w:val="0"/>
+                <w:sz w:val="16"/>
+              </w:rPr>
+              <w:t>14 640</w:t>
+            </w:r>
+          </w:p>
+        </w:tc>
+        <w:tc>
+          <w:tcPr>
+            <w:tcW w:type="dxa" w:w="1234"/>
+          </w:tcPr>
+          <w:p>
+            <w:pPr>
+              <w:spacing w:after="0" w:before="0"/>
+              <w:jc w:val="center"/>
+            </w:pPr>
+            <w:r/>
+            <w:r>
+              <w:rPr>
+                <w:b w:val="0"/>
+                <w:sz w:val="16"/>
+              </w:rPr>
+              <w:t>3 215</w:t>
+            </w:r>
+          </w:p>
+        </w:tc>
+        <w:tc>
+          <w:tcPr>
+            <w:tcW w:type="dxa" w:w="1234"/>
+          </w:tcPr>
+          <w:p>
+            <w:pPr>
+              <w:spacing w:after="0" w:before="0"/>
+              <w:jc w:val="center"/>
+            </w:pPr>
+            <w:r/>
+            <w:r>
+              <w:rPr>
+                <w:b w:val="0"/>
+                <w:sz w:val="16"/>
+              </w:rPr>
+              <w:t>38 580</w:t>
+            </w:r>
+          </w:p>
+        </w:tc>
+      </w:tr>
+      <w:tr>
+        <w:tc>
+          <w:tcPr>
+            <w:tcW w:type="dxa" w:w="1234"/>
+          </w:tcPr>
+          <w:p>
+            <w:pPr>
+              <w:spacing w:after="0" w:before="0"/>
+              <w:jc w:val="center"/>
+            </w:pPr>
+            <w:r/>
+            <w:r>
+              <w:rPr>
+                <w:b w:val="0"/>
+                <w:sz w:val="16"/>
+              </w:rPr>
+              <w:t>6</w:t>
+            </w:r>
+          </w:p>
+        </w:tc>
+        <w:tc>
+          <w:tcPr>
+            <w:tcW w:type="dxa" w:w="1234"/>
+          </w:tcPr>
+          <w:p>
+            <w:pPr>
+              <w:spacing w:after="0" w:before="0"/>
+            </w:pPr>
+            <w:r/>
+            <w:r>
+              <w:rPr>
+                <w:b w:val="0"/>
+                <w:sz w:val="15"/>
+              </w:rPr>
+              <w:t>Ручной пароочиститель под давлением (110°C)</w:t>
+            </w:r>
+          </w:p>
+        </w:tc>
+        <w:tc>
+          <w:tcPr>
+            <w:tcW w:type="dxa" w:w="1234"/>
+          </w:tcPr>
+          <w:p>
+            <w:pPr>
+              <w:spacing w:after="0" w:before="0"/>
+              <w:jc w:val="center"/>
+            </w:pPr>
+            <w:r/>
+            <w:r>
+              <w:rPr>
+                <w:b w:val="0"/>
+                <w:sz w:val="16"/>
+              </w:rPr>
+              <w:t>300</w:t>
+            </w:r>
+          </w:p>
+        </w:tc>
+        <w:tc>
+          <w:tcPr>
+            <w:tcW w:type="dxa" w:w="1234"/>
+          </w:tcPr>
+          <w:p>
+            <w:pPr>
+              <w:spacing w:after="0" w:before="0"/>
+              <w:jc w:val="center"/>
+            </w:pPr>
+            <w:r/>
+            <w:r>
+              <w:rPr>
+                <w:b w:val="0"/>
+                <w:sz w:val="16"/>
+              </w:rPr>
+              <w:t>25 101</w:t>
+            </w:r>
+          </w:p>
+        </w:tc>
+        <w:tc>
+          <w:tcPr>
+            <w:tcW w:type="dxa" w:w="1234"/>
+          </w:tcPr>
+          <w:p>
+            <w:pPr>
+              <w:spacing w:after="0" w:before="0"/>
+              <w:jc w:val="center"/>
+            </w:pPr>
+            <w:r/>
+            <w:r>
+              <w:rPr>
+                <w:b w:val="0"/>
+                <w:sz w:val="16"/>
+              </w:rPr>
+              <w:t>26 010</w:t>
+            </w:r>
+          </w:p>
+        </w:tc>
+        <w:tc>
+          <w:tcPr>
+            <w:tcW w:type="dxa" w:w="1234"/>
+          </w:tcPr>
+          <w:p>
+            <w:pPr>
+              <w:spacing w:after="0" w:before="0"/>
+              <w:jc w:val="center"/>
+            </w:pPr>
+            <w:r/>
+            <w:r>
+              <w:rPr>
+                <w:b w:val="0"/>
+                <w:sz w:val="16"/>
+              </w:rPr>
+              <w:t>6 833</w:t>
+            </w:r>
+          </w:p>
+        </w:tc>
+        <w:tc>
+          <w:tcPr>
+            <w:tcW w:type="dxa" w:w="1234"/>
+          </w:tcPr>
+          <w:p>
+            <w:pPr>
+              <w:spacing w:after="0" w:before="0"/>
+              <w:jc w:val="center"/>
+            </w:pPr>
+            <w:r/>
+            <w:r>
+              <w:rPr>
+                <w:b w:val="0"/>
+                <w:sz w:val="16"/>
+              </w:rPr>
+              <w:t>81 996</w:t>
+            </w:r>
+          </w:p>
+        </w:tc>
+      </w:tr>
+      <w:tr>
+        <w:tc>
+          <w:tcPr>
+            <w:tcW w:type="dxa" w:w="1234"/>
+          </w:tcPr>
+          <w:p>
+            <w:pPr>
+              <w:spacing w:after="0" w:before="0"/>
+              <w:jc w:val="center"/>
+            </w:pPr>
+            <w:r/>
+            <w:r>
+              <w:rPr>
+                <w:b w:val="0"/>
+                <w:sz w:val="16"/>
+              </w:rPr>
+              <w:t>7</w:t>
+            </w:r>
+          </w:p>
+        </w:tc>
+        <w:tc>
+          <w:tcPr>
+            <w:tcW w:type="dxa" w:w="1234"/>
+          </w:tcPr>
+          <w:p>
+            <w:pPr>
+              <w:spacing w:after="0" w:before="0"/>
+            </w:pPr>
+            <w:r/>
+            <w:r>
+              <w:rPr>
+                <w:b w:val="0"/>
+                <w:sz w:val="15"/>
+              </w:rPr>
+              <w:t>Отпариватель для одежды 1000W портативный</w:t>
+            </w:r>
+          </w:p>
+        </w:tc>
+        <w:tc>
+          <w:tcPr>
+            <w:tcW w:type="dxa" w:w="1234"/>
+          </w:tcPr>
+          <w:p>
+            <w:pPr>
+              <w:spacing w:after="0" w:before="0"/>
+              <w:jc w:val="center"/>
+            </w:pPr>
+            <w:r/>
+            <w:r>
+              <w:rPr>
+                <w:b w:val="0"/>
+                <w:sz w:val="16"/>
+              </w:rPr>
+              <w:t>300</w:t>
+            </w:r>
+          </w:p>
+        </w:tc>
+        <w:tc>
+          <w:tcPr>
+            <w:tcW w:type="dxa" w:w="1234"/>
+          </w:tcPr>
+          <w:p>
+            <w:pPr>
+              <w:spacing w:after="0" w:before="0"/>
+              <w:jc w:val="center"/>
+            </w:pPr>
+            <w:r/>
+            <w:r>
+              <w:rPr>
+                <w:b w:val="0"/>
+                <w:sz w:val="16"/>
+              </w:rPr>
+              <w:t>17 364</w:t>
+            </w:r>
+          </w:p>
+        </w:tc>
+        <w:tc>
+          <w:tcPr>
+            <w:tcW w:type="dxa" w:w="1234"/>
+          </w:tcPr>
+          <w:p>
+            <w:pPr>
+              <w:spacing w:after="0" w:before="0"/>
+              <w:jc w:val="center"/>
+            </w:pPr>
+            <w:r/>
+            <w:r>
+              <w:rPr>
+                <w:b w:val="0"/>
+                <w:sz w:val="16"/>
+              </w:rPr>
+              <w:t>12 240</w:t>
+            </w:r>
+          </w:p>
+        </w:tc>
+        <w:tc>
+          <w:tcPr>
+            <w:tcW w:type="dxa" w:w="1234"/>
+          </w:tcPr>
+          <w:p>
+            <w:pPr>
+              <w:spacing w:after="0" w:before="0"/>
+              <w:jc w:val="center"/>
+            </w:pPr>
+            <w:r/>
+            <w:r>
+              <w:rPr>
+                <w:b w:val="0"/>
+                <w:sz w:val="16"/>
+              </w:rPr>
+              <w:t>3 241</w:t>
+            </w:r>
+          </w:p>
+        </w:tc>
+        <w:tc>
+          <w:tcPr>
+            <w:tcW w:type="dxa" w:w="1234"/>
+          </w:tcPr>
+          <w:p>
+            <w:pPr>
+              <w:spacing w:after="0" w:before="0"/>
+              <w:jc w:val="center"/>
+            </w:pPr>
+            <w:r/>
+            <w:r>
+              <w:rPr>
+                <w:b w:val="0"/>
+                <w:sz w:val="16"/>
+              </w:rPr>
+              <w:t>38 892</w:t>
+            </w:r>
+          </w:p>
+        </w:tc>
+      </w:tr>
+      <w:tr>
+        <w:tc>
+          <w:tcPr>
+            <w:tcW w:type="dxa" w:w="1234"/>
+          </w:tcPr>
+          <w:p>
+            <w:pPr>
+              <w:spacing w:after="0" w:before="0"/>
+              <w:jc w:val="center"/>
+            </w:pPr>
+            <w:r/>
+            <w:r>
+              <w:rPr>
+                <w:b w:val="0"/>
+                <w:sz w:val="16"/>
+              </w:rPr>
+              <w:t>8</w:t>
+            </w:r>
+          </w:p>
+        </w:tc>
+        <w:tc>
+          <w:tcPr>
+            <w:tcW w:type="dxa" w:w="1234"/>
+          </w:tcPr>
+          <w:p>
+            <w:pPr>
+              <w:spacing w:after="0" w:before="0"/>
+            </w:pPr>
+            <w:r/>
+            <w:r>
+              <w:rPr>
+                <w:b w:val="0"/>
+                <w:sz w:val="15"/>
+              </w:rPr>
+              <w:t>Ремни для переноски мебели (плечевые), 2 чел.</w:t>
+            </w:r>
+          </w:p>
+        </w:tc>
+        <w:tc>
+          <w:tcPr>
+            <w:tcW w:type="dxa" w:w="1234"/>
+          </w:tcPr>
+          <w:p>
+            <w:pPr>
+              <w:spacing w:after="0" w:before="0"/>
+              <w:jc w:val="center"/>
+            </w:pPr>
+            <w:r/>
+            <w:r>
+              <w:rPr>
+                <w:b w:val="0"/>
+                <w:sz w:val="16"/>
+              </w:rPr>
+              <w:t>1 200</w:t>
+            </w:r>
+          </w:p>
+        </w:tc>
+        <w:tc>
+          <w:tcPr>
+            <w:tcW w:type="dxa" w:w="1234"/>
+          </w:tcPr>
+          <w:p>
+            <w:pPr>
+              <w:spacing w:after="0" w:before="0"/>
+              <w:jc w:val="center"/>
+            </w:pPr>
+            <w:r/>
+            <w:r>
+              <w:rPr>
+                <w:b w:val="0"/>
+                <w:sz w:val="16"/>
+              </w:rPr>
+              <w:t>35 688</w:t>
+            </w:r>
+          </w:p>
+        </w:tc>
+        <w:tc>
+          <w:tcPr>
+            <w:tcW w:type="dxa" w:w="1234"/>
+          </w:tcPr>
+          <w:p>
+            <w:pPr>
+              <w:spacing w:after="0" w:before="0"/>
+              <w:jc w:val="center"/>
+            </w:pPr>
+            <w:r/>
+            <w:r>
+              <w:rPr>
+                <w:b w:val="0"/>
+                <w:sz w:val="16"/>
+              </w:rPr>
+              <w:t>55 800</w:t>
+            </w:r>
+          </w:p>
+        </w:tc>
+        <w:tc>
+          <w:tcPr>
+            <w:tcW w:type="dxa" w:w="1234"/>
+          </w:tcPr>
+          <w:p>
+            <w:pPr>
+              <w:spacing w:after="0" w:before="0"/>
+              <w:jc w:val="center"/>
+            </w:pPr>
+            <w:r/>
+            <w:r>
+              <w:rPr>
+                <w:b w:val="0"/>
+                <w:sz w:val="16"/>
+              </w:rPr>
+              <w:t>13 707</w:t>
+            </w:r>
+          </w:p>
+        </w:tc>
+        <w:tc>
+          <w:tcPr>
+            <w:tcW w:type="dxa" w:w="1234"/>
+          </w:tcPr>
+          <w:p>
+            <w:pPr>
+              <w:spacing w:after="0" w:before="0"/>
+              <w:jc w:val="center"/>
+            </w:pPr>
+            <w:r/>
+            <w:r>
+              <w:rPr>
+                <w:b w:val="0"/>
+                <w:sz w:val="16"/>
+              </w:rPr>
+              <w:t>164 484</w:t>
+            </w:r>
+          </w:p>
+        </w:tc>
+      </w:tr>
+      <w:tr>
+        <w:tc>
+          <w:tcPr>
+            <w:tcW w:type="dxa" w:w="1234"/>
+          </w:tcPr>
+          <w:p>
+            <w:pPr>
+              <w:spacing w:after="0" w:before="0"/>
+              <w:jc w:val="center"/>
+            </w:pPr>
+            <w:r/>
+            <w:r>
+              <w:rPr>
+                <w:b w:val="0"/>
+                <w:sz w:val="16"/>
+              </w:rPr>
+              <w:t>9</w:t>
+            </w:r>
+          </w:p>
+        </w:tc>
+        <w:tc>
+          <w:tcPr>
+            <w:tcW w:type="dxa" w:w="1234"/>
+          </w:tcPr>
+          <w:p>
+            <w:pPr>
+              <w:spacing w:after="0" w:before="0"/>
+            </w:pPr>
+            <w:r/>
+            <w:r>
+              <w:rPr>
+                <w:b w:val="0"/>
+                <w:sz w:val="15"/>
+              </w:rPr>
+              <w:t>Вакуумные пакеты для хранения, 15 шт</w:t>
+            </w:r>
+          </w:p>
+        </w:tc>
+        <w:tc>
+          <w:tcPr>
+            <w:tcW w:type="dxa" w:w="1234"/>
+          </w:tcPr>
+          <w:p>
+            <w:pPr>
+              <w:spacing w:after="0" w:before="0"/>
+              <w:jc w:val="center"/>
+            </w:pPr>
+            <w:r/>
+            <w:r>
+              <w:rPr>
+                <w:b w:val="0"/>
+                <w:sz w:val="16"/>
+              </w:rPr>
+              <w:t>500</w:t>
+            </w:r>
+          </w:p>
+        </w:tc>
+        <w:tc>
+          <w:tcPr>
+            <w:tcW w:type="dxa" w:w="1234"/>
+          </w:tcPr>
+          <w:p>
+            <w:pPr>
+              <w:spacing w:after="0" w:before="0"/>
+              <w:jc w:val="center"/>
+            </w:pPr>
+            <w:r/>
+            <w:r>
+              <w:rPr>
+                <w:b w:val="0"/>
+                <w:sz w:val="16"/>
+              </w:rPr>
+              <w:t>16 240</w:t>
+            </w:r>
+          </w:p>
+        </w:tc>
+        <w:tc>
+          <w:tcPr>
+            <w:tcW w:type="dxa" w:w="1234"/>
+          </w:tcPr>
+          <w:p>
+            <w:pPr>
+              <w:spacing w:after="0" w:before="0"/>
+              <w:jc w:val="center"/>
+            </w:pPr>
+            <w:r/>
+            <w:r>
+              <w:rPr>
+                <w:b w:val="0"/>
+                <w:sz w:val="16"/>
+              </w:rPr>
+              <w:t>10 425</w:t>
+            </w:r>
+          </w:p>
+        </w:tc>
+        <w:tc>
+          <w:tcPr>
+            <w:tcW w:type="dxa" w:w="1234"/>
+          </w:tcPr>
+          <w:p>
+            <w:pPr>
+              <w:spacing w:after="0" w:before="0"/>
+              <w:jc w:val="center"/>
+            </w:pPr>
+            <w:r/>
+            <w:r>
+              <w:rPr>
+                <w:b w:val="0"/>
+                <w:sz w:val="16"/>
+              </w:rPr>
+              <w:t>2 756</w:t>
+            </w:r>
+          </w:p>
+        </w:tc>
+        <w:tc>
+          <w:tcPr>
+            <w:tcW w:type="dxa" w:w="1234"/>
+          </w:tcPr>
+          <w:p>
+            <w:pPr>
+              <w:spacing w:after="0" w:before="0"/>
+              <w:jc w:val="center"/>
+            </w:pPr>
+            <w:r/>
+            <w:r>
+              <w:rPr>
+                <w:b w:val="0"/>
+                <w:sz w:val="16"/>
+              </w:rPr>
+              <w:t>33 072</w:t>
+            </w:r>
+          </w:p>
+        </w:tc>
+      </w:tr>
+      <w:tr>
+        <w:tc>
+          <w:tcPr>
+            <w:tcW w:type="dxa" w:w="1234"/>
+          </w:tcPr>
+          <w:p>
+            <w:pPr>
+              <w:spacing w:after="0" w:before="0"/>
+              <w:jc w:val="center"/>
+            </w:pPr>
+            <w:r/>
+            <w:r>
+              <w:rPr>
+                <w:b w:val="0"/>
+                <w:sz w:val="16"/>
+              </w:rPr>
+              <w:t>10</w:t>
+            </w:r>
+          </w:p>
+        </w:tc>
+        <w:tc>
+          <w:tcPr>
+            <w:tcW w:type="dxa" w:w="1234"/>
+            <w:shd w:val="clear" w:fill="FCE4D6"/>
+          </w:tcPr>
+          <w:p>
+            <w:pPr>
+              <w:spacing w:after="0" w:before="0"/>
+            </w:pPr>
+            <w:r/>
+            <w:r>
+              <w:rPr>
+                <w:b w:val="0"/>
+                <w:sz w:val="15"/>
+              </w:rPr>
+              <w:t>Стойка для ванной телескопическая 4-ярусная (нерж.)</w:t>
+            </w:r>
+          </w:p>
+        </w:tc>
+        <w:tc>
+          <w:tcPr>
+            <w:tcW w:type="dxa" w:w="1234"/>
+          </w:tcPr>
+          <w:p>
+            <w:pPr>
+              <w:spacing w:after="0" w:before="0"/>
+              <w:jc w:val="center"/>
+            </w:pPr>
+            <w:r/>
+            <w:r>
+              <w:rPr>
+                <w:b w:val="0"/>
+                <w:sz w:val="16"/>
+              </w:rPr>
+              <w:t>400</w:t>
+            </w:r>
+          </w:p>
+        </w:tc>
+        <w:tc>
+          <w:tcPr>
+            <w:tcW w:type="dxa" w:w="1234"/>
+          </w:tcPr>
+          <w:p>
+            <w:pPr>
+              <w:spacing w:after="0" w:before="0"/>
+              <w:jc w:val="center"/>
+            </w:pPr>
+            <w:r/>
+            <w:r>
+              <w:rPr>
+                <w:b w:val="0"/>
+                <w:sz w:val="16"/>
+              </w:rPr>
+              <w:t>15 824</w:t>
+            </w:r>
+          </w:p>
+        </w:tc>
+        <w:tc>
+          <w:tcPr>
+            <w:tcW w:type="dxa" w:w="1234"/>
+          </w:tcPr>
+          <w:p>
+            <w:pPr>
+              <w:spacing w:after="0" w:before="0"/>
+              <w:jc w:val="center"/>
+            </w:pPr>
+            <w:r/>
+            <w:r>
+              <w:rPr>
+                <w:b w:val="0"/>
+                <w:sz w:val="16"/>
+              </w:rPr>
+              <w:t>14 760</w:t>
+            </w:r>
+          </w:p>
+        </w:tc>
+        <w:tc>
+          <w:tcPr>
+            <w:tcW w:type="dxa" w:w="1234"/>
+          </w:tcPr>
+          <w:p>
+            <w:pPr>
+              <w:spacing w:after="0" w:before="0"/>
+              <w:jc w:val="center"/>
+            </w:pPr>
+            <w:r/>
+            <w:r>
+              <w:rPr>
+                <w:b w:val="0"/>
+                <w:sz w:val="16"/>
+              </w:rPr>
+              <w:t>2 451</w:t>
+            </w:r>
+          </w:p>
+        </w:tc>
+        <w:tc>
+          <w:tcPr>
+            <w:tcW w:type="dxa" w:w="1234"/>
+          </w:tcPr>
+          <w:p>
+            <w:pPr>
+              <w:spacing w:after="0" w:before="0"/>
+              <w:jc w:val="center"/>
+            </w:pPr>
+            <w:r/>
+            <w:r>
+              <w:rPr>
+                <w:b w:val="0"/>
+                <w:sz w:val="16"/>
+              </w:rPr>
+              <w:t>29 412</w:t>
+            </w:r>
+          </w:p>
+        </w:tc>
+      </w:tr>
+      <w:tr>
+        <w:tc>
+          <w:tcPr>
+            <w:tcW w:type="dxa" w:w="1234"/>
+          </w:tcPr>
+          <w:p>
+            <w:pPr>
+              <w:spacing w:after="0" w:before="0"/>
+              <w:jc w:val="center"/>
+            </w:pPr>
+            <w:r/>
+            <w:r>
+              <w:rPr>
+                <w:b w:val="0"/>
+                <w:sz w:val="16"/>
+              </w:rPr>
+              <w:t>11</w:t>
+            </w:r>
+          </w:p>
+        </w:tc>
+        <w:tc>
+          <w:tcPr>
+            <w:tcW w:type="dxa" w:w="1234"/>
+          </w:tcPr>
+          <w:p>
+            <w:pPr>
+              <w:spacing w:after="0" w:before="0"/>
+            </w:pPr>
+            <w:r/>
+            <w:r>
+              <w:rPr>
+                <w:b w:val="0"/>
+                <w:sz w:val="15"/>
+              </w:rPr>
+              <w:t>Корзина для белья с крышкой, складная 100 л</w:t>
+            </w:r>
+          </w:p>
+        </w:tc>
+        <w:tc>
+          <w:tcPr>
+            <w:tcW w:type="dxa" w:w="1234"/>
+          </w:tcPr>
+          <w:p>
+            <w:pPr>
+              <w:spacing w:after="0" w:before="0"/>
+              <w:jc w:val="center"/>
+            </w:pPr>
+            <w:r/>
+            <w:r>
+              <w:rPr>
+                <w:b w:val="0"/>
+                <w:sz w:val="16"/>
+              </w:rPr>
+              <w:t>400</w:t>
+            </w:r>
+          </w:p>
+        </w:tc>
+        <w:tc>
+          <w:tcPr>
+            <w:tcW w:type="dxa" w:w="1234"/>
+          </w:tcPr>
+          <w:p>
+            <w:pPr>
+              <w:spacing w:after="0" w:before="0"/>
+              <w:jc w:val="center"/>
+            </w:pPr>
+            <w:r/>
+            <w:r>
+              <w:rPr>
+                <w:b w:val="0"/>
+                <w:sz w:val="16"/>
+              </w:rPr>
+              <w:t>8 516</w:t>
+            </w:r>
+          </w:p>
+        </w:tc>
+        <w:tc>
+          <w:tcPr>
+            <w:tcW w:type="dxa" w:w="1234"/>
+          </w:tcPr>
+          <w:p>
+            <w:pPr>
+              <w:spacing w:after="0" w:before="0"/>
+              <w:jc w:val="center"/>
+            </w:pPr>
+            <w:r/>
+            <w:r>
+              <w:rPr>
+                <w:b w:val="0"/>
+                <w:sz w:val="16"/>
+              </w:rPr>
+              <w:t>6 150</w:t>
+            </w:r>
+          </w:p>
+        </w:tc>
+        <w:tc>
+          <w:tcPr>
+            <w:tcW w:type="dxa" w:w="1234"/>
+          </w:tcPr>
+          <w:p>
+            <w:pPr>
+              <w:spacing w:after="0" w:before="0"/>
+              <w:jc w:val="center"/>
+            </w:pPr>
+            <w:r/>
+            <w:r>
+              <w:rPr>
+                <w:b w:val="0"/>
+                <w:sz w:val="16"/>
+              </w:rPr>
+              <w:t>1 020</w:t>
+            </w:r>
+          </w:p>
+        </w:tc>
+        <w:tc>
+          <w:tcPr>
+            <w:tcW w:type="dxa" w:w="1234"/>
+          </w:tcPr>
+          <w:p>
+            <w:pPr>
+              <w:spacing w:after="0" w:before="0"/>
+              <w:jc w:val="center"/>
+            </w:pPr>
+            <w:r/>
+            <w:r>
+              <w:rPr>
+                <w:b w:val="0"/>
+                <w:sz w:val="16"/>
+              </w:rPr>
+              <w:t>12 240</w:t>
+            </w:r>
+          </w:p>
+        </w:tc>
+      </w:tr>
+      <w:tr>
+        <w:tc>
+          <w:tcPr>
+            <w:tcW w:type="dxa" w:w="1234"/>
+          </w:tcPr>
+          <w:p>
+            <w:pPr>
+              <w:spacing w:after="0" w:before="0"/>
+              <w:jc w:val="center"/>
+            </w:pPr>
+            <w:r/>
+            <w:r>
+              <w:rPr>
+                <w:b w:val="0"/>
+                <w:sz w:val="16"/>
+              </w:rPr>
+              <w:t>12</w:t>
+            </w:r>
+          </w:p>
+        </w:tc>
+        <w:tc>
+          <w:tcPr>
+            <w:tcW w:type="dxa" w:w="1234"/>
+          </w:tcPr>
+          <w:p>
+            <w:pPr>
+              <w:spacing w:after="0" w:before="0"/>
+            </w:pPr>
+            <w:r/>
+            <w:r>
+              <w:rPr>
+                <w:b w:val="0"/>
+                <w:sz w:val="15"/>
+              </w:rPr>
+              <w:t>Набор кухонных ножей 8 предметов (нерж., подставка)</w:t>
+            </w:r>
+          </w:p>
+        </w:tc>
+        <w:tc>
+          <w:tcPr>
+            <w:tcW w:type="dxa" w:w="1234"/>
+          </w:tcPr>
+          <w:p>
+            <w:pPr>
+              <w:spacing w:after="0" w:before="0"/>
+              <w:jc w:val="center"/>
+            </w:pPr>
+            <w:r/>
+            <w:r>
+              <w:rPr>
+                <w:b w:val="0"/>
+                <w:sz w:val="16"/>
+              </w:rPr>
+              <w:t>400</w:t>
+            </w:r>
+          </w:p>
+        </w:tc>
+        <w:tc>
+          <w:tcPr>
+            <w:tcW w:type="dxa" w:w="1234"/>
+          </w:tcPr>
+          <w:p>
+            <w:pPr>
+              <w:spacing w:after="0" w:before="0"/>
+              <w:jc w:val="center"/>
+            </w:pPr>
+            <w:r/>
+            <w:r>
+              <w:rPr>
+                <w:b w:val="0"/>
+                <w:sz w:val="16"/>
+              </w:rPr>
+              <w:t>12 636</w:t>
+            </w:r>
+          </w:p>
+        </w:tc>
+        <w:tc>
+          <w:tcPr>
+            <w:tcW w:type="dxa" w:w="1234"/>
+          </w:tcPr>
+          <w:p>
+            <w:pPr>
+              <w:spacing w:after="0" w:before="0"/>
+              <w:jc w:val="center"/>
+            </w:pPr>
+            <w:r/>
+            <w:r>
+              <w:rPr>
+                <w:b w:val="0"/>
+                <w:sz w:val="16"/>
+              </w:rPr>
+              <w:t>7 440</w:t>
+            </w:r>
+          </w:p>
+        </w:tc>
+        <w:tc>
+          <w:tcPr>
+            <w:tcW w:type="dxa" w:w="1234"/>
+          </w:tcPr>
+          <w:p>
+            <w:pPr>
+              <w:spacing w:after="0" w:before="0"/>
+              <w:jc w:val="center"/>
+            </w:pPr>
+            <w:r/>
+            <w:r>
+              <w:rPr>
+                <w:b w:val="0"/>
+                <w:sz w:val="16"/>
+              </w:rPr>
+              <w:t>1 717</w:t>
+            </w:r>
+          </w:p>
+        </w:tc>
+        <w:tc>
+          <w:tcPr>
+            <w:tcW w:type="dxa" w:w="1234"/>
+          </w:tcPr>
+          <w:p>
+            <w:pPr>
+              <w:spacing w:after="0" w:before="0"/>
+              <w:jc w:val="center"/>
+            </w:pPr>
+            <w:r/>
+            <w:r>
+              <w:rPr>
+                <w:b w:val="0"/>
+                <w:sz w:val="16"/>
+              </w:rPr>
+              <w:t>20 604</w:t>
+            </w:r>
+          </w:p>
+        </w:tc>
+      </w:tr>
+      <w:tr>
+        <w:tc>
+          <w:tcPr>
+            <w:tcW w:type="dxa" w:w="1234"/>
+          </w:tcPr>
+          <w:p>
+            <w:pPr>
+              <w:spacing w:after="0" w:before="0"/>
+              <w:jc w:val="center"/>
+            </w:pPr>
+            <w:r/>
+            <w:r>
+              <w:rPr>
+                <w:b w:val="0"/>
+                <w:sz w:val="16"/>
+              </w:rPr>
+              <w:t>13</w:t>
+            </w:r>
+          </w:p>
+        </w:tc>
+        <w:tc>
+          <w:tcPr>
+            <w:tcW w:type="dxa" w:w="1234"/>
+          </w:tcPr>
+          <w:p>
+            <w:pPr>
+              <w:spacing w:after="0" w:before="0"/>
+            </w:pPr>
+            <w:r/>
+            <w:r>
+              <w:rPr>
+                <w:b w:val="0"/>
+                <w:sz w:val="15"/>
+              </w:rPr>
+              <w:t>Вакуумные пакеты с беспроводным электронасосом (travel)</w:t>
+            </w:r>
+          </w:p>
+        </w:tc>
+        <w:tc>
+          <w:tcPr>
+            <w:tcW w:type="dxa" w:w="1234"/>
+          </w:tcPr>
+          <w:p>
+            <w:pPr>
+              <w:spacing w:after="0" w:before="0"/>
+              <w:jc w:val="center"/>
+            </w:pPr>
+            <w:r/>
+            <w:r>
+              <w:rPr>
+                <w:b w:val="0"/>
+                <w:sz w:val="16"/>
+              </w:rPr>
+              <w:t>300</w:t>
+            </w:r>
+          </w:p>
+        </w:tc>
+        <w:tc>
+          <w:tcPr>
+            <w:tcW w:type="dxa" w:w="1234"/>
+          </w:tcPr>
+          <w:p>
+            <w:pPr>
+              <w:spacing w:after="0" w:before="0"/>
+              <w:jc w:val="center"/>
+            </w:pPr>
+            <w:r/>
+            <w:r>
+              <w:rPr>
+                <w:b w:val="0"/>
+                <w:sz w:val="16"/>
+              </w:rPr>
+              <w:t>8 727</w:t>
+            </w:r>
+          </w:p>
+        </w:tc>
+        <w:tc>
+          <w:tcPr>
+            <w:tcW w:type="dxa" w:w="1234"/>
+          </w:tcPr>
+          <w:p>
+            <w:pPr>
+              <w:spacing w:after="0" w:before="0"/>
+              <w:jc w:val="center"/>
+            </w:pPr>
+            <w:r/>
+            <w:r>
+              <w:rPr>
+                <w:b w:val="0"/>
+                <w:sz w:val="16"/>
+              </w:rPr>
+              <w:t>7 440</w:t>
+            </w:r>
+          </w:p>
+        </w:tc>
+        <w:tc>
+          <w:tcPr>
+            <w:tcW w:type="dxa" w:w="1234"/>
+          </w:tcPr>
+          <w:p>
+            <w:pPr>
+              <w:spacing w:after="0" w:before="0"/>
+              <w:jc w:val="center"/>
+            </w:pPr>
+            <w:r/>
+            <w:r>
+              <w:rPr>
+                <w:b w:val="0"/>
+                <w:sz w:val="16"/>
+              </w:rPr>
+              <w:t>1 866</w:t>
+            </w:r>
+          </w:p>
+        </w:tc>
+        <w:tc>
+          <w:tcPr>
+            <w:tcW w:type="dxa" w:w="1234"/>
+          </w:tcPr>
+          <w:p>
+            <w:pPr>
+              <w:spacing w:after="0" w:before="0"/>
+              <w:jc w:val="center"/>
+            </w:pPr>
+            <w:r/>
+            <w:r>
+              <w:rPr>
+                <w:b w:val="0"/>
+                <w:sz w:val="16"/>
+              </w:rPr>
+              <w:t>22 392</w:t>
+            </w:r>
+          </w:p>
+        </w:tc>
+      </w:tr>
+      <w:tr>
+        <w:tc>
+          <w:tcPr>
+            <w:tcW w:type="dxa" w:w="1234"/>
+          </w:tcPr>
+          <w:p>
+            <w:pPr>
+              <w:spacing w:after="0" w:before="0"/>
+              <w:jc w:val="center"/>
+            </w:pPr>
+            <w:r/>
+            <w:r>
+              <w:rPr>
+                <w:b w:val="0"/>
+                <w:sz w:val="16"/>
+              </w:rPr>
+              <w:t>14</w:t>
+            </w:r>
+          </w:p>
+        </w:tc>
+        <w:tc>
+          <w:tcPr>
+            <w:tcW w:type="dxa" w:w="1234"/>
+          </w:tcPr>
+          <w:p>
+            <w:pPr>
+              <w:spacing w:after="0" w:before="0"/>
+            </w:pPr>
+            <w:r/>
+            <w:r>
+              <w:rPr>
+                <w:b w:val="0"/>
+                <w:sz w:val="15"/>
+              </w:rPr>
+              <w:t>Искусственная зелень эвкалипт, 130 шт (декор)</w:t>
+            </w:r>
+          </w:p>
+        </w:tc>
+        <w:tc>
+          <w:tcPr>
+            <w:tcW w:type="dxa" w:w="1234"/>
+          </w:tcPr>
+          <w:p>
+            <w:pPr>
+              <w:spacing w:after="0" w:before="0"/>
+              <w:jc w:val="center"/>
+            </w:pPr>
+            <w:r/>
+            <w:r>
+              <w:rPr>
+                <w:b w:val="0"/>
+                <w:sz w:val="16"/>
+              </w:rPr>
+              <w:t>500</w:t>
+            </w:r>
+          </w:p>
+        </w:tc>
+        <w:tc>
+          <w:tcPr>
+            <w:tcW w:type="dxa" w:w="1234"/>
+          </w:tcPr>
+          <w:p>
+            <w:pPr>
+              <w:spacing w:after="0" w:before="0"/>
+              <w:jc w:val="center"/>
+            </w:pPr>
+            <w:r/>
+            <w:r>
+              <w:rPr>
+                <w:b w:val="0"/>
+                <w:sz w:val="16"/>
+              </w:rPr>
+              <w:t>13 995</w:t>
+            </w:r>
+          </w:p>
+        </w:tc>
+        <w:tc>
+          <w:tcPr>
+            <w:tcW w:type="dxa" w:w="1234"/>
+          </w:tcPr>
+          <w:p>
+            <w:pPr>
+              <w:spacing w:after="0" w:before="0"/>
+              <w:jc w:val="center"/>
+            </w:pPr>
+            <w:r/>
+            <w:r>
+              <w:rPr>
+                <w:b w:val="0"/>
+                <w:sz w:val="16"/>
+              </w:rPr>
+              <w:t>11 970</w:t>
+            </w:r>
+          </w:p>
+        </w:tc>
+        <w:tc>
+          <w:tcPr>
+            <w:tcW w:type="dxa" w:w="1234"/>
+          </w:tcPr>
+          <w:p>
+            <w:pPr>
+              <w:spacing w:after="0" w:before="0"/>
+              <w:jc w:val="center"/>
+            </w:pPr>
+            <w:r/>
+            <w:r>
+              <w:rPr>
+                <w:b w:val="0"/>
+                <w:sz w:val="16"/>
+              </w:rPr>
+              <w:t>3 116</w:t>
+            </w:r>
+          </w:p>
+        </w:tc>
+        <w:tc>
+          <w:tcPr>
+            <w:tcW w:type="dxa" w:w="1234"/>
+          </w:tcPr>
+          <w:p>
+            <w:pPr>
+              <w:spacing w:after="0" w:before="0"/>
+              <w:jc w:val="center"/>
+            </w:pPr>
+            <w:r/>
+            <w:r>
+              <w:rPr>
+                <w:b w:val="0"/>
+                <w:sz w:val="16"/>
+              </w:rPr>
+              <w:t>37 392</w:t>
+            </w:r>
+          </w:p>
+        </w:tc>
+      </w:tr>
+      <w:tr>
+        <w:tc>
+          <w:tcPr>
+            <w:tcW w:type="dxa" w:w="1234"/>
+          </w:tcPr>
+          <w:p>
+            <w:pPr>
+              <w:spacing w:after="0" w:before="0"/>
+              <w:jc w:val="center"/>
+            </w:pPr>
+            <w:r/>
+            <w:r>
+              <w:rPr>
+                <w:b w:val="0"/>
+                <w:sz w:val="16"/>
+              </w:rPr>
+              <w:t>15</w:t>
+            </w:r>
+          </w:p>
+        </w:tc>
+        <w:tc>
+          <w:tcPr>
+            <w:tcW w:type="dxa" w:w="1234"/>
+            <w:shd w:val="clear" w:fill="FCE4D6"/>
+          </w:tcPr>
+          <w:p>
+            <w:pPr>
+              <w:spacing w:after="0" w:before="0"/>
+            </w:pPr>
+            <w:r/>
+            <w:r>
+              <w:rPr>
+                <w:b w:val="0"/>
+                <w:sz w:val="15"/>
+              </w:rPr>
+              <w:t>Офисное кресло руководителя, эко-кожа</w:t>
+            </w:r>
+          </w:p>
+        </w:tc>
+        <w:tc>
+          <w:tcPr>
+            <w:tcW w:type="dxa" w:w="1234"/>
+          </w:tcPr>
+          <w:p>
+            <w:pPr>
+              <w:spacing w:after="0" w:before="0"/>
+              <w:jc w:val="center"/>
+            </w:pPr>
+            <w:r/>
+            <w:r>
+              <w:rPr>
+                <w:b w:val="0"/>
+                <w:sz w:val="16"/>
+              </w:rPr>
+              <w:t>120</w:t>
+            </w:r>
+          </w:p>
+        </w:tc>
+        <w:tc>
+          <w:tcPr>
+            <w:tcW w:type="dxa" w:w="1234"/>
+          </w:tcPr>
+          <w:p>
+            <w:pPr>
+              <w:spacing w:after="0" w:before="0"/>
+              <w:jc w:val="center"/>
+            </w:pPr>
+            <w:r/>
+            <w:r>
+              <w:rPr>
+                <w:b w:val="0"/>
+                <w:sz w:val="16"/>
+              </w:rPr>
+              <w:t>33 084</w:t>
+            </w:r>
+          </w:p>
+        </w:tc>
+        <w:tc>
+          <w:tcPr>
+            <w:tcW w:type="dxa" w:w="1234"/>
+          </w:tcPr>
+          <w:p>
+            <w:pPr>
+              <w:spacing w:after="0" w:before="0"/>
+              <w:jc w:val="center"/>
+            </w:pPr>
+            <w:r/>
+            <w:r>
+              <w:rPr>
+                <w:b w:val="0"/>
+                <w:sz w:val="16"/>
+              </w:rPr>
+              <w:t>7 416</w:t>
+            </w:r>
+          </w:p>
+        </w:tc>
+        <w:tc>
+          <w:tcPr>
+            <w:tcW w:type="dxa" w:w="1234"/>
+          </w:tcPr>
+          <w:p>
+            <w:pPr>
+              <w:spacing w:after="0" w:before="0"/>
+              <w:jc w:val="center"/>
+            </w:pPr>
+            <w:r/>
+            <w:r>
+              <w:rPr>
+                <w:b w:val="0"/>
+                <w:sz w:val="16"/>
+              </w:rPr>
+              <w:t>1 284</w:t>
+            </w:r>
+          </w:p>
+        </w:tc>
+        <w:tc>
+          <w:tcPr>
+            <w:tcW w:type="dxa" w:w="1234"/>
+          </w:tcPr>
+          <w:p>
+            <w:pPr>
+              <w:spacing w:after="0" w:before="0"/>
+              <w:jc w:val="center"/>
+            </w:pPr>
+            <w:r/>
+            <w:r>
+              <w:rPr>
+                <w:b w:val="0"/>
+                <w:sz w:val="16"/>
+              </w:rPr>
+              <w:t>15 408</w:t>
+            </w:r>
+          </w:p>
+        </w:tc>
+      </w:tr>
+      <w:tr>
+        <w:tc>
+          <w:tcPr>
+            <w:tcW w:type="dxa" w:w="1234"/>
+          </w:tcPr>
+          <w:p>
+            <w:pPr>
+              <w:spacing w:after="0" w:before="0"/>
+              <w:jc w:val="center"/>
+            </w:pPr>
+            <w:r/>
+            <w:r>
+              <w:rPr>
+                <w:b w:val="0"/>
+                <w:sz w:val="16"/>
+              </w:rPr>
+              <w:t>16</w:t>
+            </w:r>
+          </w:p>
+        </w:tc>
+        <w:tc>
+          <w:tcPr>
+            <w:tcW w:type="dxa" w:w="1234"/>
+            <w:shd w:val="clear" w:fill="FCE4D6"/>
+          </w:tcPr>
+          <w:p>
+            <w:pPr>
+              <w:spacing w:after="0" w:before="0"/>
+            </w:pPr>
+            <w:r/>
+            <w:r>
+              <w:rPr>
+                <w:b w:val="0"/>
+                <w:sz w:val="15"/>
+              </w:rPr>
+              <w:t>Эргономичное офисное кресло (сетка), для долгой работы</w:t>
+            </w:r>
+          </w:p>
+        </w:tc>
+        <w:tc>
+          <w:tcPr>
+            <w:tcW w:type="dxa" w:w="1234"/>
+          </w:tcPr>
+          <w:p>
+            <w:pPr>
+              <w:spacing w:after="0" w:before="0"/>
+              <w:jc w:val="center"/>
+            </w:pPr>
+            <w:r/>
+            <w:r>
+              <w:rPr>
+                <w:b w:val="0"/>
+                <w:sz w:val="16"/>
+              </w:rPr>
+              <w:t>120</w:t>
+            </w:r>
+          </w:p>
+        </w:tc>
+        <w:tc>
+          <w:tcPr>
+            <w:tcW w:type="dxa" w:w="1234"/>
+          </w:tcPr>
+          <w:p>
+            <w:pPr>
+              <w:spacing w:after="0" w:before="0"/>
+              <w:jc w:val="center"/>
+            </w:pPr>
+            <w:r/>
+            <w:r>
+              <w:rPr>
+                <w:b w:val="0"/>
+                <w:sz w:val="16"/>
+              </w:rPr>
+              <w:t>28 357</w:t>
+            </w:r>
+          </w:p>
+        </w:tc>
+        <w:tc>
+          <w:tcPr>
+            <w:tcW w:type="dxa" w:w="1234"/>
+          </w:tcPr>
+          <w:p>
+            <w:pPr>
+              <w:spacing w:after="0" w:before="0"/>
+              <w:jc w:val="center"/>
+            </w:pPr>
+            <w:r/>
+            <w:r>
+              <w:rPr>
+                <w:b w:val="0"/>
+                <w:sz w:val="16"/>
+              </w:rPr>
+              <w:t>5 512</w:t>
+            </w:r>
+          </w:p>
+        </w:tc>
+        <w:tc>
+          <w:tcPr>
+            <w:tcW w:type="dxa" w:w="1234"/>
+          </w:tcPr>
+          <w:p>
+            <w:pPr>
+              <w:spacing w:after="0" w:before="0"/>
+              <w:jc w:val="center"/>
+            </w:pPr>
+            <w:r/>
+            <w:r>
+              <w:rPr>
+                <w:b w:val="0"/>
+                <w:sz w:val="16"/>
+              </w:rPr>
+              <w:t>890</w:t>
+            </w:r>
+          </w:p>
+        </w:tc>
+        <w:tc>
+          <w:tcPr>
+            <w:tcW w:type="dxa" w:w="1234"/>
+          </w:tcPr>
+          <w:p>
+            <w:pPr>
+              <w:spacing w:after="0" w:before="0"/>
+              <w:jc w:val="center"/>
+            </w:pPr>
+            <w:r/>
+            <w:r>
+              <w:rPr>
+                <w:b w:val="0"/>
+                <w:sz w:val="16"/>
+              </w:rPr>
+              <w:t>10 680</w:t>
+            </w:r>
+          </w:p>
+        </w:tc>
+      </w:tr>
+      <w:tr>
+        <w:tc>
+          <w:tcPr>
+            <w:tcW w:type="dxa" w:w="1234"/>
+          </w:tcPr>
+          <w:p>
+            <w:pPr>
+              <w:spacing w:after="0" w:before="0"/>
+              <w:jc w:val="center"/>
+            </w:pPr>
+            <w:r/>
+            <w:r>
+              <w:rPr>
+                <w:b w:val="0"/>
+                <w:sz w:val="16"/>
+              </w:rPr>
+              <w:t>17</w:t>
+            </w:r>
+          </w:p>
+        </w:tc>
+        <w:tc>
+          <w:tcPr>
+            <w:tcW w:type="dxa" w:w="1234"/>
+            <w:shd w:val="clear" w:fill="FCE4D6"/>
+          </w:tcPr>
+          <w:p>
+            <w:pPr>
+              <w:spacing w:after="0" w:before="0"/>
+            </w:pPr>
+            <w:r/>
+            <w:r>
+              <w:rPr>
+                <w:b w:val="0"/>
+                <w:sz w:val="15"/>
+              </w:rPr>
+              <w:t>Офисное кресло эргономичное (сетка) с подголовником</w:t>
+            </w:r>
+          </w:p>
+        </w:tc>
+        <w:tc>
+          <w:tcPr>
+            <w:tcW w:type="dxa" w:w="1234"/>
+          </w:tcPr>
+          <w:p>
+            <w:pPr>
+              <w:spacing w:after="0" w:before="0"/>
+              <w:jc w:val="center"/>
+            </w:pPr>
+            <w:r/>
+            <w:r>
+              <w:rPr>
+                <w:b w:val="0"/>
+                <w:sz w:val="16"/>
+              </w:rPr>
+              <w:t>150</w:t>
+            </w:r>
+          </w:p>
+        </w:tc>
+        <w:tc>
+          <w:tcPr>
+            <w:tcW w:type="dxa" w:w="1234"/>
+          </w:tcPr>
+          <w:p>
+            <w:pPr>
+              <w:spacing w:after="0" w:before="0"/>
+              <w:jc w:val="center"/>
+            </w:pPr>
+            <w:r/>
+            <w:r>
+              <w:rPr>
+                <w:b w:val="0"/>
+                <w:sz w:val="16"/>
+              </w:rPr>
+              <w:t>33 970</w:t>
+            </w:r>
+          </w:p>
+        </w:tc>
+        <w:tc>
+          <w:tcPr>
+            <w:tcW w:type="dxa" w:w="1234"/>
+          </w:tcPr>
+          <w:p>
+            <w:pPr>
+              <w:spacing w:after="0" w:before="0"/>
+              <w:jc w:val="center"/>
+            </w:pPr>
+            <w:r/>
+            <w:r>
+              <w:rPr>
+                <w:b w:val="0"/>
+                <w:sz w:val="16"/>
+              </w:rPr>
+              <w:t>9 660</w:t>
+            </w:r>
+          </w:p>
+        </w:tc>
+        <w:tc>
+          <w:tcPr>
+            <w:tcW w:type="dxa" w:w="1234"/>
+          </w:tcPr>
+          <w:p>
+            <w:pPr>
+              <w:spacing w:after="0" w:before="0"/>
+              <w:jc w:val="center"/>
+            </w:pPr>
+            <w:r/>
+            <w:r>
+              <w:rPr>
+                <w:b w:val="0"/>
+                <w:sz w:val="16"/>
+              </w:rPr>
+              <w:t>1 522</w:t>
+            </w:r>
+          </w:p>
+        </w:tc>
+        <w:tc>
+          <w:tcPr>
+            <w:tcW w:type="dxa" w:w="1234"/>
+          </w:tcPr>
+          <w:p>
+            <w:pPr>
+              <w:spacing w:after="0" w:before="0"/>
+              <w:jc w:val="center"/>
+            </w:pPr>
+            <w:r/>
+            <w:r>
+              <w:rPr>
+                <w:b w:val="0"/>
+                <w:sz w:val="16"/>
+              </w:rPr>
+              <w:t>18 264</w:t>
+            </w:r>
+          </w:p>
+        </w:tc>
+      </w:tr>
+      <w:tr>
+        <w:tc>
+          <w:tcPr>
+            <w:tcW w:type="dxa" w:w="1234"/>
+          </w:tcPr>
+          <w:p>
+            <w:pPr>
+              <w:spacing w:after="0" w:before="0"/>
+              <w:jc w:val="center"/>
+            </w:pPr>
+            <w:r/>
+            <w:r>
+              <w:rPr>
+                <w:b w:val="0"/>
+                <w:sz w:val="16"/>
+              </w:rPr>
+              <w:t>18</w:t>
+            </w:r>
+          </w:p>
+        </w:tc>
+        <w:tc>
+          <w:tcPr>
+            <w:tcW w:type="dxa" w:w="1234"/>
+            <w:shd w:val="clear" w:fill="FCE4D6"/>
+          </w:tcPr>
+          <w:p>
+            <w:pPr>
+              <w:spacing w:after="0" w:before="0"/>
+            </w:pPr>
+            <w:r/>
+            <w:r>
+              <w:rPr>
+                <w:b w:val="0"/>
+                <w:sz w:val="15"/>
+              </w:rPr>
+              <w:t>Кресло усиленное Big&amp;Tall (до ~180 кг), откидные подлокотники</w:t>
+            </w:r>
+          </w:p>
+        </w:tc>
+        <w:tc>
+          <w:tcPr>
+            <w:tcW w:type="dxa" w:w="1234"/>
+          </w:tcPr>
+          <w:p>
+            <w:pPr>
+              <w:spacing w:after="0" w:before="0"/>
+              <w:jc w:val="center"/>
+            </w:pPr>
+            <w:r/>
+            <w:r>
+              <w:rPr>
+                <w:b w:val="0"/>
+                <w:sz w:val="16"/>
+              </w:rPr>
+              <w:t>80</w:t>
+            </w:r>
+          </w:p>
+        </w:tc>
+        <w:tc>
+          <w:tcPr>
+            <w:tcW w:type="dxa" w:w="1234"/>
+          </w:tcPr>
+          <w:p>
+            <w:pPr>
+              <w:spacing w:after="0" w:before="0"/>
+              <w:jc w:val="center"/>
+            </w:pPr>
+            <w:r/>
+            <w:r>
+              <w:rPr>
+                <w:b w:val="0"/>
+                <w:sz w:val="16"/>
+              </w:rPr>
+              <w:t>31 080</w:t>
+            </w:r>
+          </w:p>
+        </w:tc>
+        <w:tc>
+          <w:tcPr>
+            <w:tcW w:type="dxa" w:w="1234"/>
+          </w:tcPr>
+          <w:p>
+            <w:pPr>
+              <w:spacing w:after="0" w:before="0"/>
+              <w:jc w:val="center"/>
+            </w:pPr>
+            <w:r/>
+            <w:r>
+              <w:rPr>
+                <w:b w:val="0"/>
+                <w:sz w:val="16"/>
+              </w:rPr>
+              <w:t>6 204</w:t>
+            </w:r>
+          </w:p>
+        </w:tc>
+        <w:tc>
+          <w:tcPr>
+            <w:tcW w:type="dxa" w:w="1234"/>
+          </w:tcPr>
+          <w:p>
+            <w:pPr>
+              <w:spacing w:after="0" w:before="0"/>
+              <w:jc w:val="center"/>
+            </w:pPr>
+            <w:r/>
+            <w:r>
+              <w:rPr>
+                <w:b w:val="0"/>
+                <w:sz w:val="16"/>
+              </w:rPr>
+              <w:t>854</w:t>
+            </w:r>
+          </w:p>
+        </w:tc>
+        <w:tc>
+          <w:tcPr>
+            <w:tcW w:type="dxa" w:w="1234"/>
+          </w:tcPr>
+          <w:p>
+            <w:pPr>
+              <w:spacing w:after="0" w:before="0"/>
+              <w:jc w:val="center"/>
+            </w:pPr>
+            <w:r/>
+            <w:r>
+              <w:rPr>
+                <w:b w:val="0"/>
+                <w:sz w:val="16"/>
+              </w:rPr>
+              <w:t>10 248</w:t>
+            </w:r>
+          </w:p>
+        </w:tc>
+      </w:tr>
+      <w:tr>
+        <w:tc>
+          <w:tcPr>
+            <w:tcW w:type="dxa" w:w="1234"/>
+          </w:tcPr>
+          <w:p>
+            <w:pPr>
+              <w:spacing w:after="0" w:before="0"/>
+              <w:jc w:val="center"/>
+            </w:pPr>
+            <w:r/>
+            <w:r>
+              <w:rPr>
+                <w:b w:val="0"/>
+                <w:sz w:val="16"/>
+              </w:rPr>
+              <w:t>19</w:t>
+            </w:r>
+          </w:p>
+        </w:tc>
+        <w:tc>
+          <w:tcPr>
+            <w:tcW w:type="dxa" w:w="1234"/>
+            <w:shd w:val="clear" w:fill="FCE4D6"/>
+          </w:tcPr>
+          <w:p>
+            <w:pPr>
+              <w:spacing w:after="0" w:before="0"/>
+            </w:pPr>
+            <w:r/>
+            <w:r>
+              <w:rPr>
+                <w:b w:val="0"/>
+                <w:sz w:val="15"/>
+              </w:rPr>
+              <w:t>Ковер 8x10 (240x300) бохо, для гостиной</w:t>
+            </w:r>
+          </w:p>
+        </w:tc>
+        <w:tc>
+          <w:tcPr>
+            <w:tcW w:type="dxa" w:w="1234"/>
+          </w:tcPr>
+          <w:p>
+            <w:pPr>
+              <w:spacing w:after="0" w:before="0"/>
+              <w:jc w:val="center"/>
+            </w:pPr>
+            <w:r/>
+            <w:r>
+              <w:rPr>
+                <w:b w:val="0"/>
+                <w:sz w:val="16"/>
+              </w:rPr>
+              <w:t>200</w:t>
+            </w:r>
+          </w:p>
+        </w:tc>
+        <w:tc>
+          <w:tcPr>
+            <w:tcW w:type="dxa" w:w="1234"/>
+          </w:tcPr>
+          <w:p>
+            <w:pPr>
+              <w:spacing w:after="0" w:before="0"/>
+              <w:jc w:val="center"/>
+            </w:pPr>
+            <w:r/>
+            <w:r>
+              <w:rPr>
+                <w:b w:val="0"/>
+                <w:sz w:val="16"/>
+              </w:rPr>
+              <w:t>18 592</w:t>
+            </w:r>
+          </w:p>
+        </w:tc>
+        <w:tc>
+          <w:tcPr>
+            <w:tcW w:type="dxa" w:w="1234"/>
+          </w:tcPr>
+          <w:p>
+            <w:pPr>
+              <w:spacing w:after="0" w:before="0"/>
+              <w:jc w:val="center"/>
+            </w:pPr>
+            <w:r/>
+            <w:r>
+              <w:rPr>
+                <w:b w:val="0"/>
+                <w:sz w:val="16"/>
+              </w:rPr>
+              <w:t>18 840</w:t>
+            </w:r>
+          </w:p>
+        </w:tc>
+        <w:tc>
+          <w:tcPr>
+            <w:tcW w:type="dxa" w:w="1234"/>
+          </w:tcPr>
+          <w:p>
+            <w:pPr>
+              <w:spacing w:after="0" w:before="0"/>
+              <w:jc w:val="center"/>
+            </w:pPr>
+            <w:r/>
+            <w:r>
+              <w:rPr>
+                <w:b w:val="0"/>
+                <w:sz w:val="16"/>
+              </w:rPr>
+              <w:t>4 571</w:t>
+            </w:r>
+          </w:p>
+        </w:tc>
+        <w:tc>
+          <w:tcPr>
+            <w:tcW w:type="dxa" w:w="1234"/>
+          </w:tcPr>
+          <w:p>
+            <w:pPr>
+              <w:spacing w:after="0" w:before="0"/>
+              <w:jc w:val="center"/>
+            </w:pPr>
+            <w:r/>
+            <w:r>
+              <w:rPr>
+                <w:b w:val="0"/>
+                <w:sz w:val="16"/>
+              </w:rPr>
+              <w:t>54 852</w:t>
+            </w:r>
+          </w:p>
+        </w:tc>
+      </w:tr>
+      <w:tr>
+        <w:tc>
+          <w:tcPr>
+            <w:tcW w:type="dxa" w:w="1234"/>
+          </w:tcPr>
+          <w:p>
+            <w:pPr>
+              <w:spacing w:after="0" w:before="0"/>
+              <w:jc w:val="center"/>
+            </w:pPr>
+            <w:r/>
+            <w:r>
+              <w:rPr>
+                <w:b w:val="0"/>
+                <w:sz w:val="16"/>
+              </w:rPr>
+              <w:t>20</w:t>
+            </w:r>
+          </w:p>
+        </w:tc>
+        <w:tc>
+          <w:tcPr>
+            <w:tcW w:type="dxa" w:w="1234"/>
+            <w:shd w:val="clear" w:fill="FCE4D6"/>
+          </w:tcPr>
+          <w:p>
+            <w:pPr>
+              <w:spacing w:after="0" w:before="0"/>
+            </w:pPr>
+            <w:r/>
+            <w:r>
+              <w:rPr>
+                <w:b w:val="0"/>
+                <w:sz w:val="15"/>
+              </w:rPr>
+              <w:t>Коврик под офисное кресло (защита пола), XL</w:t>
+            </w:r>
+          </w:p>
+        </w:tc>
+        <w:tc>
+          <w:tcPr>
+            <w:tcW w:type="dxa" w:w="1234"/>
+          </w:tcPr>
+          <w:p>
+            <w:pPr>
+              <w:spacing w:after="0" w:before="0"/>
+              <w:jc w:val="center"/>
+            </w:pPr>
+            <w:r/>
+            <w:r>
+              <w:rPr>
+                <w:b w:val="0"/>
+                <w:sz w:val="16"/>
+              </w:rPr>
+              <w:t>200</w:t>
+            </w:r>
+          </w:p>
+        </w:tc>
+        <w:tc>
+          <w:tcPr>
+            <w:tcW w:type="dxa" w:w="1234"/>
+          </w:tcPr>
+          <w:p>
+            <w:pPr>
+              <w:spacing w:after="0" w:before="0"/>
+              <w:jc w:val="center"/>
+            </w:pPr>
+            <w:r/>
+            <w:r>
+              <w:rPr>
+                <w:b w:val="0"/>
+                <w:sz w:val="16"/>
+              </w:rPr>
+              <w:t>15 638</w:t>
+            </w:r>
+          </w:p>
+        </w:tc>
+        <w:tc>
+          <w:tcPr>
+            <w:tcW w:type="dxa" w:w="1234"/>
+          </w:tcPr>
+          <w:p>
+            <w:pPr>
+              <w:spacing w:after="0" w:before="0"/>
+              <w:jc w:val="center"/>
+            </w:pPr>
+            <w:r/>
+            <w:r>
+              <w:rPr>
+                <w:b w:val="0"/>
+                <w:sz w:val="16"/>
+              </w:rPr>
+              <w:t>1 524</w:t>
+            </w:r>
+          </w:p>
+        </w:tc>
+        <w:tc>
+          <w:tcPr>
+            <w:tcW w:type="dxa" w:w="1234"/>
+          </w:tcPr>
+          <w:p>
+            <w:pPr>
+              <w:spacing w:after="0" w:before="0"/>
+              <w:jc w:val="center"/>
+            </w:pPr>
+            <w:r/>
+            <w:r>
+              <w:rPr>
+                <w:b w:val="0"/>
+                <w:sz w:val="16"/>
+              </w:rPr>
+              <w:t>257</w:t>
+            </w:r>
+          </w:p>
+        </w:tc>
+        <w:tc>
+          <w:tcPr>
+            <w:tcW w:type="dxa" w:w="1234"/>
+          </w:tcPr>
+          <w:p>
+            <w:pPr>
+              <w:spacing w:after="0" w:before="0"/>
+              <w:jc w:val="center"/>
+            </w:pPr>
+            <w:r/>
+            <w:r>
+              <w:rPr>
+                <w:b w:val="0"/>
+                <w:sz w:val="16"/>
+              </w:rPr>
+              <w:t>3 084</w:t>
+            </w:r>
+          </w:p>
+        </w:tc>
+      </w:tr>
+      <w:tr>
+        <w:tc>
+          <w:tcPr>
+            <w:tcW w:type="dxa" w:w="1234"/>
+            <w:shd w:val="clear" w:fill="D9E1F2"/>
+          </w:tcPr>
+          <w:p/>
+        </w:tc>
+        <w:tc>
+          <w:tcPr>
+            <w:tcW w:type="dxa" w:w="1234"/>
+            <w:shd w:val="clear" w:fill="D9E1F2"/>
+          </w:tcPr>
+          <w:p>
+            <w:pPr>
+              <w:spacing w:after="0" w:before="0"/>
+            </w:pPr>
+            <w:r/>
+            <w:r>
+              <w:rPr>
+                <w:b/>
+                <w:sz w:val="16"/>
+              </w:rPr>
+              <w:t>ИТОГО (20 SKU)</w:t>
+            </w:r>
+          </w:p>
+        </w:tc>
+        <w:tc>
+          <w:tcPr>
+            <w:tcW w:type="dxa" w:w="1234"/>
+            <w:shd w:val="clear" w:fill="D9E1F2"/>
+          </w:tcPr>
+          <w:p/>
+        </w:tc>
+        <w:tc>
+          <w:tcPr>
+            <w:tcW w:type="dxa" w:w="1234"/>
+            <w:shd w:val="clear" w:fill="D9E1F2"/>
+          </w:tcPr>
+          <w:p>
+            <w:pPr>
+              <w:spacing w:after="0" w:before="0"/>
+              <w:jc w:val="center"/>
+            </w:pPr>
+            <w:r/>
+            <w:r>
+              <w:rPr>
+                <w:b/>
+                <w:sz w:val="16"/>
+              </w:rPr>
+              <w:t>417 422</w:t>
+            </w:r>
+          </w:p>
+        </w:tc>
+        <w:tc>
+          <w:tcPr>
+            <w:tcW w:type="dxa" w:w="1234"/>
+            <w:shd w:val="clear" w:fill="D9E1F2"/>
+          </w:tcPr>
+          <w:p>
+            <w:pPr>
+              <w:spacing w:after="0" w:before="0"/>
+              <w:jc w:val="center"/>
+            </w:pPr>
+            <w:r/>
+            <w:r>
+              <w:rPr>
+                <w:b/>
+                <w:sz w:val="16"/>
+              </w:rPr>
+              <w:t>305 731</w:t>
+            </w:r>
+          </w:p>
+        </w:tc>
+        <w:tc>
+          <w:tcPr>
+            <w:tcW w:type="dxa" w:w="1234"/>
+            <w:shd w:val="clear" w:fill="D9E1F2"/>
+          </w:tcPr>
+          <w:p>
+            <w:pPr>
+              <w:spacing w:after="0" w:before="0"/>
+              <w:jc w:val="center"/>
+            </w:pPr>
+            <w:r/>
+            <w:r>
+              <w:rPr>
+                <w:b/>
+                <w:sz w:val="16"/>
+              </w:rPr>
+              <w:t>73 247</w:t>
+            </w:r>
+          </w:p>
+        </w:tc>
+        <w:tc>
+          <w:tcPr>
+            <w:tcW w:type="dxa" w:w="1234"/>
+            <w:shd w:val="clear" w:fill="D9E1F2"/>
+          </w:tcPr>
+          <w:p>
+            <w:pPr>
+              <w:spacing w:after="0" w:before="0"/>
+              <w:jc w:val="center"/>
+            </w:pPr>
+            <w:r/>
+            <w:r>
+              <w:rPr>
+                <w:b/>
+                <w:sz w:val="16"/>
+              </w:rPr>
+              <w:t>878 964</w:t>
+            </w:r>
+          </w:p>
+        </w:tc>
+      </w:tr>
+    </w:tbl>
+    <w:p>
+      <w:pPr>
+        <w:spacing w:after="40"/>
+      </w:pPr>
+      <w:r>
+        <w:rPr>
+          <w:b w:val="0"/>
+          <w:sz w:val="21"/>
+        </w:rPr>
+      </w:r>
+    </w:p>
+    <w:p>
+      <w:pPr>
+        <w:spacing w:after="40"/>
+      </w:pPr>
+      <w:r>
+        <w:rPr>
+          <w:b/>
+          <w:sz w:val="21"/>
+        </w:rPr>
+        <w:t>Итог по деньгам:</w:t>
+      </w:r>
+    </w:p>
+    <w:p>
+      <w:pPr>
+        <w:pStyle w:val="ListBullet"/>
+        <w:spacing w:after="40"/>
+      </w:pPr>
+      <w:r>
+        <w:rPr>
+          <w:b/>
+        </w:rPr>
+        <w:t xml:space="preserve">Потратим: </w:t>
+      </w:r>
+      <w:r>
+        <w:t>417 422 AED — закупка (оборотный капитал); 141 900 AED — бюджет запуска; ИТОГО старт ≈ 559 322 AED ($152 300).</w:t>
+      </w:r>
+    </w:p>
+    <w:p>
+      <w:pPr>
+        <w:pStyle w:val="ListBullet"/>
+        <w:spacing w:after="40"/>
+      </w:pPr>
+      <w:r>
+        <w:rPr>
+          <w:b/>
+        </w:rPr>
+        <w:t xml:space="preserve">Заработаем (полный разгон): </w:t>
+      </w:r>
+      <w:r>
+        <w:t>выручка ≈ 305 731 AED/мес  EBITDA ≈ 73 247 AED/мес (≈ 878 964 AED/год)  после налога 9% ≈ 66 655 AED/мес.</w:t>
+      </w:r>
+    </w:p>
+    <w:p>
+      <w:pPr>
+        <w:spacing w:after="40"/>
+      </w:pPr>
+      <w:r>
+        <w:rPr>
+          <w:b/>
+          <w:sz w:val="21"/>
+        </w:rPr>
+        <w:t>Реалистичный 1-й год (с разгоном, PPC 35% в старте):</w:t>
+      </w:r>
+    </w:p>
+    <w:p>
+      <w:pPr>
+        <w:pStyle w:val="ListBullet"/>
+        <w:spacing w:after="40"/>
+      </w:pPr>
+      <w:r>
+        <w:t>мес 1-3 (запуск  40% объёма): -22 095 AED (инвестиция в разгон);</w:t>
+      </w:r>
+    </w:p>
+    <w:p>
+      <w:pPr>
+        <w:pStyle w:val="ListBullet"/>
+        <w:spacing w:after="40"/>
+      </w:pPr>
+      <w:r>
+        <w:t>мес 4-6 (70% объёма): +153 944 AED; мес 7-12 (100%): +439 839 AED;</w:t>
+      </w:r>
+    </w:p>
+    <w:p>
+      <w:pPr>
+        <w:pStyle w:val="ListBullet"/>
+        <w:spacing w:after="40"/>
+      </w:pPr>
+      <w:r>
+        <w:rPr>
+          <w:b/>
+        </w:rPr>
+        <w:t xml:space="preserve">Итог: </w:t>
+      </w:r>
+      <w:r>
+        <w:t>EBITDA 1-го года ≈ 571 687 AED (после налога ≈ 520 236); за вычетом бюджета запуска — денежный результат ≈ 378 336 AED ($103 019). Оборотный капитал 417 422 AED остаётся в товаре и крутится.</w:t>
       </w:r>
     </w:p>
     <w:p>

</xml_diff>